<commit_message>
Refine German Engineering and Rubicon weight logic
</commit_message>
<xml_diff>
--- a/docs/uvicorn main.docx
+++ b/docs/uvicorn main.docx
@@ -32,6 +32,13 @@
           <w:t>https://github.com/YOURUSERNAME/SAB-Catalog-Auditor-Web.git</w:t>
         </w:r>
       </w:hyperlink>
+    </w:p>
+    <w:p/>
+    <w:p/>
+    <w:p>
+      <w:r>
+        <w:t>python main.py</w:t>
+      </w:r>
     </w:p>
     <w:sectPr>
       <w:pgSz w:w="12240" w:h="15840"/>

</xml_diff>